<commit_message>
Promote v2 to root + add Executive Summary + refresh CV
- Root / now renders the v2 design (re-export)
- New Executive Summary section (position 02) — full narrative + 6 highlight chips, wrapped in OrbitBorder
- Section kickers renumbered (Signature→03, Capabilities→04, Frameworks→05, Timeline→06, Credentials→07, Contact→08)
- Dividers updated to match
- profile.executiveSummary added as single source of truth
- Frameworks: Smart Services deployment → "150+ smart services mapped and 40+ smart-city initiatives delivered end-to-end"
- Frameworks: Innovation Ecosystem deployment → "8 Living Labs delivered, 85+ pilots landed"
- Hero stat: "Programmes led" → "Major programmes led"
- Copy: "Managing Director-level leader" → "C-Suite advisor" (site + CV)
- scripts/build_cv.py updated to reflect site content; DOCX + PDF regenerated

Co-Authored-By: claude-flow <ruv@ruv.net>
</commit_message>
<xml_diff>
--- a/public/anthony-penwright-cv.docx
+++ b/public/anthony-penwright-cv.docx
@@ -29,7 +29,7 @@
           <w:color w:val="C8532C"/>
           <w:sz w:val="23"/>
         </w:rPr>
-        <w:t>Managing Director  ·  Smart Cities  ·  Digital Infrastructure  ·  Innovation Ecosystems</w:t>
+        <w:t>C-Suite Advisor  ·  Smart Cities  ·  Digital Infrastructure  ·  Innovation Ecosystems</w:t>
       </w:r>
     </w:p>
     <w:p>
@@ -69,7 +69,7 @@
           <w:sz w:val="19"/>
           <w:spacing w:val="40"/>
         </w:rPr>
-        <w:t>Professional Profile</w:t>
+        <w:t>Executive Summary</w:t>
       </w:r>
     </w:p>
     <w:p>
@@ -92,7 +92,22 @@
           <w:color w:val="111111"/>
           <w:sz w:val="20"/>
         </w:rPr>
-        <w:t>Managing Director-level leader with 20+ years across smart city operations, digital infrastructure and innovation ecosystem programmes — author of the Verax Smart Services Advisory, Innovation Ecosystem, Operations Advisory and Value Realisation Office methodologies, with live deployments across UAE, KSA and LATAM. Accountable for £1BN+ programme portfolios at NEOM, Cisco, Wipro and UK Government, having led 40+ smart city and digital infrastructure projects from strategic vision through procurement, delivery and operational handover.</w:t>
+        <w:t>C-Suite advisor codifying 20+ years of global smart-city and digital-infrastructure delivery into frameworks that work. $1.3BN+ of programme value delivered across 40+ major initiatives and 13 sectors — MoD DII(F) (150,000 workstations · 242 sites · 150+ countries), NEOM ($290M digital master plan · $120M innovation portfolio), FCO (99.8% SLA across the diplomatic estate), Cisco's global Smart City practice (built from zero to $315M), and Quantela ($18M → $90M in eighteen months).</w:t>
+      </w:r>
+    </w:p>
+    <w:p>
+      <w:pPr>
+        <w:spacing w:before="0" w:after="100"/>
+      </w:pPr>
+      <w:r>
+        <w:rPr>
+          <w:rFonts w:ascii="Calibri" w:hAnsi="Calibri"/>
+          <w:b w:val="0"/>
+          <w:i w:val="0"/>
+          <w:color w:val="111111"/>
+          <w:sz w:val="20"/>
+        </w:rPr>
+        <w:t>Author of four proprietary methodologies — Smart Services Advisory, Innovation Ecosystem Advisory, Operations Advisory and the Value Realisation Office — live across DMCC Uptown Dubai, NEOM Sindalah, Red Sea Global and Strive Services Group KSA. Founder &amp; Principal of Verax Venture Studio: AI-native, 7 active portfolio ventures, 44+ agent skills with master-agent orchestration across CRM, KYC, brand and operations.</w:t>
       </w:r>
     </w:p>
     <w:p>
@@ -181,7 +196,7 @@
                 <w:color w:val="C8532C"/>
                 <w:sz w:val="36"/>
               </w:rPr>
-              <w:t>£1BN+</w:t>
+              <w:t>$1.3BN+</w:t>
             </w:r>
           </w:p>
         </w:tc>
@@ -223,7 +238,7 @@
                 <w:color w:val="C8532C"/>
                 <w:sz w:val="36"/>
               </w:rPr>
-              <w:t>20+</w:t>
+              <w:t>13</w:t>
             </w:r>
           </w:p>
         </w:tc>
@@ -244,7 +259,7 @@
                 <w:color w:val="C8532C"/>
                 <w:sz w:val="36"/>
               </w:rPr>
-              <w:t>450+</w:t>
+              <w:t>7</w:t>
             </w:r>
           </w:p>
         </w:tc>
@@ -265,7 +280,7 @@
                 <w:color w:val="C8532C"/>
                 <w:sz w:val="36"/>
               </w:rPr>
-              <w:t>9</w:t>
+              <w:t>4</w:t>
             </w:r>
           </w:p>
         </w:tc>
@@ -309,7 +324,7 @@
                 <w:color w:val="555B66"/>
                 <w:sz w:val="17"/>
               </w:rPr>
-              <w:t>Smart city projects led</w:t>
+              <w:t>Major programmes led</w:t>
             </w:r>
           </w:p>
         </w:tc>
@@ -330,7 +345,7 @@
                 <w:color w:val="555B66"/>
                 <w:sz w:val="17"/>
               </w:rPr>
-              <w:t>Years executive leadership</w:t>
+              <w:t>Sectors delivered</w:t>
             </w:r>
           </w:p>
         </w:tc>
@@ -351,7 +366,7 @@
                 <w:color w:val="555B66"/>
                 <w:sz w:val="17"/>
               </w:rPr>
-              <w:t>Team resources directed</w:t>
+              <w:t>Active ventures (Verax)</w:t>
             </w:r>
           </w:p>
         </w:tc>
@@ -372,7 +387,7 @@
                 <w:color w:val="555B66"/>
                 <w:sz w:val="17"/>
               </w:rPr>
-              <w:t>Director-level roles held</w:t>
+              <w:t>Proprietary frameworks</w:t>
             </w:r>
           </w:p>
         </w:tc>
@@ -1035,7 +1050,7 @@
           <w:color w:val="111111"/>
           <w:sz w:val="19"/>
         </w:rPr>
-        <w:t>Deployed: DMCC Uptown Dubai (40+ candidate services scored, full procurement-ready portfolio), NEOM Sindalah, Red Sea Global.</w:t>
+        <w:t>Deployed: 150+ smart services mapped and 40+ smart-city initiatives delivered end-to-end — DMCC Uptown Dubai, NEOM Sindalah, Red Sea Global.</w:t>
       </w:r>
     </w:p>
     <w:p>
@@ -1100,7 +1115,7 @@
           <w:color w:val="111111"/>
           <w:sz w:val="19"/>
         </w:rPr>
-        <w:t>Deployed: Strive Services Group (KSA) — smart-FM demand pipeline, vendor registry and governance committee established.</w:t>
+        <w:t>Deployed: 8 Living Labs delivered, 85+ pilots landed — Strive Services Group (KSA) smart-FM demand pipeline, vendor registry and governance committee established.</w:t>
       </w:r>
     </w:p>
     <w:p>

</xml_diff>

<commit_message>
Rewrite Executive Summary as a 3-beat story + drop-cap
- profile.executiveSummary now an array of 3 paragraphs (who I am / proof / now & how to engage)
- Hero paragraph gets an accent emerald drop-cap for editorial rhythm
- Body text spans full card width (removed max-w-4xl) so it aligns with the highlight-chip row
- CV rebuilt with matching 3-paragraph narrative

Co-Authored-By: claude-flow <ruv@ruv.net>
</commit_message>
<xml_diff>
--- a/public/anthony-penwright-cv.docx
+++ b/public/anthony-penwright-cv.docx
@@ -92,7 +92,7 @@
           <w:color w:val="111111"/>
           <w:sz w:val="20"/>
         </w:rPr>
-        <w:t>C-Suite advisor codifying 20+ years of global smart-city and digital-infrastructure delivery into frameworks that work. $1.3BN+ of programme value delivered across 40+ major initiatives and 13 sectors — MoD DII(F) (150,000 workstations · 242 sites · 150+ countries), NEOM ($290M digital master plan · $120M innovation portfolio), FCO (99.8% SLA across the diplomatic estate), Cisco's global Smart City practice (built from zero to $315M), and Quantela ($18M → $90M in eighteen months).</w:t>
+        <w:t>For two decades I've built and operated the systems that make giga-projects, government estates and smart cities actually work. Today I codify that experience into frameworks — clean, deployable, measurable — so the next wave of leaders can skip the expensive lessons.</w:t>
       </w:r>
     </w:p>
     <w:p>
@@ -107,7 +107,22 @@
           <w:color w:val="111111"/>
           <w:sz w:val="20"/>
         </w:rPr>
-        <w:t>Author of four proprietary methodologies — Smart Services Advisory, Innovation Ecosystem Advisory, Operations Advisory and the Value Realisation Office — live across DMCC Uptown Dubai, NEOM Sindalah, Red Sea Global and Strive Services Group KSA. Founder &amp; Principal of Verax Venture Studio: AI-native, 7 active portfolio ventures, 44+ agent skills with master-agent orchestration across CRM, KYC, brand and operations.</w:t>
+        <w:t>$1.3BN+ of programme value delivered across 40+ major initiatives and 13 sectors. MoD DII(F): 150,000 workstations across 242 sites in 150+ countries. NEOM: $290M digital master plan and a $120M innovation portfolio. FCO: 99.8% SLA across the diplomatic estate. Cisco's global Smart City practice — built from zero to $315M. Quantela — grown from $18M to $90M in eighteen months.</w:t>
+      </w:r>
+    </w:p>
+    <w:p>
+      <w:pPr>
+        <w:spacing w:before="0" w:after="100"/>
+      </w:pPr>
+      <w:r>
+        <w:rPr>
+          <w:rFonts w:ascii="Calibri" w:hAnsi="Calibri"/>
+          <w:b w:val="0"/>
+          <w:i w:val="0"/>
+          <w:color w:val="111111"/>
+          <w:sz w:val="20"/>
+        </w:rPr>
+        <w:t>Founder &amp; Principal of Verax Venture Studio: AI-native, seven active portfolio ventures, 44+ agent skills with master-agent orchestration across CRM, KYC, brand and operations. The four Verax frameworks — Smart Services Advisory, Innovation Ecosystem Advisory, Operations Advisory and the Value Realisation Office — are live across DMCC Uptown Dubai, NEOM Sindalah, Red Sea Global and Strive Services Group KSA. UK SC / DV eligible. Riyadh-based, globally mobile.</w:t>
       </w:r>
     </w:p>
     <w:p>

</xml_diff>

<commit_message>
Rewrite Executive Summary as a human connection statement
The chips carry the numbers; the prose carries the person.
Three beats: who I am (motivation), what I do (approach), how I do it (invitation).

Co-Authored-By: claude-flow <ruv@ruv.net>
</commit_message>
<xml_diff>
--- a/public/anthony-penwright-cv.docx
+++ b/public/anthony-penwright-cv.docx
@@ -92,7 +92,7 @@
           <w:color w:val="111111"/>
           <w:sz w:val="20"/>
         </w:rPr>
-        <w:t>For two decades I've built and operated the systems that make giga-projects, government estates and smart cities actually work. Today I codify that experience into frameworks — clean, deployable, measurable — so the next wave of leaders can skip the expensive lessons.</w:t>
+        <w:t>I'm drawn to the hard problems at the edge of technology and human institutions — the places where ambitious ideas meet the messy reality of how governments, communities and industries actually operate. For two decades, that's been my work: sitting between the boardroom and the delivery room, translating intent into systems that hold.</w:t>
       </w:r>
     </w:p>
     <w:p>
@@ -107,7 +107,7 @@
           <w:color w:val="111111"/>
           <w:sz w:val="20"/>
         </w:rPr>
-        <w:t>$1.3BN+ of programme value delivered across 40+ major initiatives and 13 sectors. MoD DII(F): 150,000 workstations across 242 sites in 150+ countries. NEOM: $290M digital master plan and a $120M innovation portfolio. FCO: 99.8% SLA across the diplomatic estate. Cisco's global Smart City practice — built from zero to $315M. Quantela — grown from $18M to $90M in eighteen months.</w:t>
+        <w:t>What I do is make complexity legible. I listen first, map the terrain — politics, technology, money, people — and shape interventions that can actually move through all of them. When things work, it's rarely because of one brilliant idea; it's because every layer below the decision was designed to carry it.</w:t>
       </w:r>
     </w:p>
     <w:p>
@@ -122,7 +122,7 @@
           <w:color w:val="111111"/>
           <w:sz w:val="20"/>
         </w:rPr>
-        <w:t>Founder &amp; Principal of Verax Venture Studio: AI-native, seven active portfolio ventures, 44+ agent skills with master-agent orchestration across CRM, KYC, brand and operations. The four Verax frameworks — Smart Services Advisory, Innovation Ecosystem Advisory, Operations Advisory and the Value Realisation Office — are live across DMCC Uptown Dubai, NEOM Sindalah, Red Sea Global and Strive Services Group KSA. UK SC / DV eligible. Riyadh-based, globally mobile.</w:t>
+        <w:t>Lately I've been codifying what I've learned into four practitioner frameworks so the next generation of leaders don't have to repeat the same expensive mistakes. I build ventures inside my own studio to keep the craft sharp. If you're standing at the start of something ambitious and need a partner who can see the whole board and stay in it with you — that's what I'm here for.</w:t>
       </w:r>
     </w:p>
     <w:p>

</xml_diff>